<commit_message>
style: full spelling before LINKO acronym in abstract, intro and cover letter
</commit_message>
<xml_diff>
--- a/LINKO_manuscript_english.docx
+++ b/LINKO_manuscript_english.docx
@@ -82,7 +82,7 @@
           <w:rFonts w:ascii="Times New Roman" w:hAnsi="Times New Roman"/>
           <w:i w:val="0"/>
         </w:rPr>
-        <w:t>Meta-analysis pools one effect estimate per study, yet studies differ in how many variables they measure and in how the endpoint sits within that variable space. We formalise this structural feature within the LINKO (Latent Information Normalization for Key Outcomes) framework, whose core descriptor is the Information Contribution Ratio (ICR); we define its estimand, give estimators computable from published baseline tables and from individual participant data, and evaluate what the measure can and cannot support. In a Monte Carlo study with Monte Carlo standard errors, scenarios with heterogeneous ICR did not show a clearly higher I-squared than scenarios with uniform ICR (difference -0.41 percentage points, 95% Monte Carlo confidence interval [-1.91, 1.10]), and a negative-control scenario in which ICR varied without any structural mechanism produced comparable heterogeneity. Adding near-duplicate covariates changed the dimension-counting estimator to 0.50 times its original value while an eigenvalue-based effective-dimension version was essentially unchanged, showing that ICR is sensitive to variable counting conventions. In two published trial collections and in an exploratory analysis of eight country groups of the International Stroke Trial, ICR varied substantially across studies; the regression-based principal component estimator was associated with 14-day mortality (P = 0.003), but the groups are not independent trials and the analysis is hypothesis-generating. We conclude that ICR is best used as a reproducible descriptor of data structure and as a reporting adjunct, not as a validity criterion for pooling. All results are regenerated from public data by the accompanying code.</w:t>
+        <w:t>Meta-analysis pools one effect estimate per study, yet studies differ in how many variables they measure and in how the endpoint sits within that variable space. We formalise this structural feature within the Latent Information Normalization for Key Outcomes (LINKO) framework, whose core descriptor is the Information Contribution Ratio (ICR); we define its estimand, give estimators computable from published baseline tables and from individual participant data, and evaluate what the measure can and cannot support. In a Monte Carlo study with Monte Carlo standard errors, scenarios with heterogeneous ICR did not show a clearly higher I-squared than scenarios with uniform ICR (difference -0.41 percentage points, 95% Monte Carlo confidence interval [-1.91, 1.10]), and a negative-control scenario in which ICR varied without any structural mechanism produced comparable heterogeneity. Adding near-duplicate covariates changed the dimension-counting estimator to 0.50 times its original value while an eigenvalue-based effective-dimension version was essentially unchanged, showing that ICR is sensitive to variable counting conventions. In two published trial collections and in an exploratory analysis of eight country groups of the International Stroke Trial, ICR varied substantially across studies; the regression-based principal component estimator was associated with 14-day mortality (P = 0.003), but the groups are not independent trials and the analysis is hypothesis-generating. We conclude that ICR is best used as a reproducible descriptor of data structure and as a reporting adjunct, not as a validity criterion for pooling. All results are regenerated from public data by the accompanying code.</w:t>
       </w:r>
     </w:p>
     <w:p>
@@ -139,7 +139,7 @@
           <w:rFonts w:ascii="Times New Roman" w:hAnsi="Times New Roman"/>
           <w:i w:val="0"/>
         </w:rPr>
-        <w:t xml:space="preserve">A trial measuring ten baseline variables and a trial measuring eighty differ in an obvious way that is invisible to standard heterogeneity statistics. Whether this difference matters for pooling is an empirical question that, to our knowledge, has not been formalised. This paper does three things. First, it introduces the LINKO (Latent Information Normalization for Key Outcomes) framework, in which the Information Contribution Ratio (ICR) is the descriptor of the share of a study's measured information carried by its endpoint, together with an explicit estimand and estimators for both published summary statistics and individual participant data (IPD). Second, it tests, rather than assumes, the hypothesis that dispersion in ICR across studies is associated with statistical heterogeneity, using a simulation study with negative controls and Monte Carlo standard errors </w:t>
+        <w:t xml:space="preserve">A trial measuring ten baseline variables and a trial measuring eighty differ in an obvious way that is invisible to standard heterogeneity statistics. Whether this difference matters for pooling is an empirical question that, to our knowledge, has not been formalised. This paper does three things. First, it introduces the Latent Information Normalization for Key Outcomes (LINKO) framework, in which the Information Contribution Ratio (ICR) is the descriptor of the share of a study's measured information carried by its endpoint, together with an explicit estimand and estimators for both published summary statistics and individual participant data (IPD). Second, it tests, rather than assumes, the hypothesis that dispersion in ICR across studies is associated with statistical heterogeneity, using a simulation study with negative controls and Monte Carlo standard errors </w:t>
       </w:r>
       <w:r>
         <w:rPr>

</xml_diff>

<commit_message>
feat: render equations as native Word OMML math objects
- add src/omml_equations.py linear-math tokenizer/OMML builder
- wire build_omml() into generate_docx.py eq blocks
- regenerate DOCX/PPTX/tables/cover-letter/manuscript.md

Co-Authored-By: Tatsuki Onishi <bougtoir@gmail.com>
</commit_message>
<xml_diff>
--- a/LINKO_manuscript_english.docx
+++ b/LINKO_manuscript_english.docx
@@ -209,12 +209,144 @@
       <w:pPr>
         <w:ind w:left="720"/>
       </w:pPr>
+      <m:oMath>
+        <m:r>
+          <w:rPr>
+            <w:rFonts w:ascii="Cambria Math" w:hAnsi="Cambria Math"/>
+            <w:sz w:val="24"/>
+            <w:szCs w:val="24"/>
+          </w:rPr>
+          <m:t xml:space="preserve">ICR</m:t>
+        </m:r>
+        <m:r>
+          <m:rPr>
+            <m:sty m:val="p"/>
+          </m:rPr>
+          <w:rPr>
+            <w:rFonts w:ascii="Cambria Math" w:hAnsi="Cambria Math"/>
+            <w:sz w:val="24"/>
+            <w:szCs w:val="24"/>
+          </w:rPr>
+          <m:t xml:space="preserve">=</m:t>
+        </m:r>
+        <m:r>
+          <w:rPr>
+            <w:rFonts w:ascii="Cambria Math" w:hAnsi="Cambria Math"/>
+            <w:sz w:val="24"/>
+            <w:szCs w:val="24"/>
+          </w:rPr>
+          <m:t xml:space="preserve">f</m:t>
+        </m:r>
+        <m:d>
+          <m:dPr>
+            <m:begChr m:val="("/>
+            <m:endChr m:val=")"/>
+          </m:dPr>
+          <m:e>
+            <m:r>
+              <w:rPr>
+                <w:rFonts w:ascii="Cambria Math" w:hAnsi="Cambria Math"/>
+                <w:sz w:val="24"/>
+                <w:szCs w:val="24"/>
+              </w:rPr>
+              <m:t xml:space="preserve">E</m:t>
+            </m:r>
+            <m:r>
+              <m:rPr>
+                <m:sty m:val="p"/>
+              </m:rPr>
+              <w:rPr>
+                <w:rFonts w:ascii="Cambria Math" w:hAnsi="Cambria Math"/>
+                <w:sz w:val="24"/>
+                <w:szCs w:val="24"/>
+              </w:rPr>
+              <m:t xml:space="preserve">;</m:t>
+            </m:r>
+            <m:sSub>
+              <m:e>
+                <m:r>
+                  <w:rPr>
+                    <w:rFonts w:ascii="Cambria Math" w:hAnsi="Cambria Math"/>
+                    <w:sz w:val="24"/>
+                    <w:szCs w:val="24"/>
+                  </w:rPr>
+                  <m:t xml:space="preserve">X</m:t>
+                </m:r>
+              </m:e>
+              <m:sub>
+                <m:r>
+                  <w:rPr>
+                    <w:rFonts w:ascii="Cambria Math" w:hAnsi="Cambria Math"/>
+                    <w:sz w:val="24"/>
+                    <w:szCs w:val="24"/>
+                  </w:rPr>
+                  <m:t xml:space="preserve">1</m:t>
+                </m:r>
+              </m:sub>
+            </m:sSub>
+            <m:r>
+              <m:rPr>
+                <m:sty m:val="p"/>
+              </m:rPr>
+              <w:rPr>
+                <w:rFonts w:ascii="Cambria Math" w:hAnsi="Cambria Math"/>
+                <w:sz w:val="24"/>
+                <w:szCs w:val="24"/>
+              </w:rPr>
+              <m:t xml:space="preserve">,</m:t>
+            </m:r>
+            <m:r>
+              <m:rPr>
+                <m:sty m:val="p"/>
+              </m:rPr>
+              <w:rPr>
+                <w:rFonts w:ascii="Cambria Math" w:hAnsi="Cambria Math"/>
+                <w:sz w:val="24"/>
+                <w:szCs w:val="24"/>
+              </w:rPr>
+              <m:t xml:space="preserve">…</m:t>
+            </m:r>
+            <m:r>
+              <m:rPr>
+                <m:sty m:val="p"/>
+              </m:rPr>
+              <w:rPr>
+                <w:rFonts w:ascii="Cambria Math" w:hAnsi="Cambria Math"/>
+                <w:sz w:val="24"/>
+                <w:szCs w:val="24"/>
+              </w:rPr>
+              <m:t xml:space="preserve">,</m:t>
+            </m:r>
+            <m:sSub>
+              <m:e>
+                <m:r>
+                  <w:rPr>
+                    <w:rFonts w:ascii="Cambria Math" w:hAnsi="Cambria Math"/>
+                    <w:sz w:val="24"/>
+                    <w:szCs w:val="24"/>
+                  </w:rPr>
+                  <m:t xml:space="preserve">X</m:t>
+                </m:r>
+              </m:e>
+              <m:sub>
+                <m:r>
+                  <w:rPr>
+                    <w:rFonts w:ascii="Cambria Math" w:hAnsi="Cambria Math"/>
+                    <w:sz w:val="24"/>
+                    <w:szCs w:val="24"/>
+                  </w:rPr>
+                  <m:t xml:space="preserve">D</m:t>
+                </m:r>
+              </m:sub>
+            </m:sSub>
+          </m:e>
+        </m:d>
+      </m:oMath>
       <w:r>
         <w:rPr>
           <w:rFonts w:ascii="Times New Roman" w:hAnsi="Times New Roman"/>
-          <w:i/>
         </w:rPr>
-        <w:t>ICR = f(E; X_1,...,X_D),</w:t>
+        <w:t>,</w:t>
       </w:r>
     </w:p>
     <w:p>
@@ -264,12 +396,68 @@
       <w:pPr>
         <w:ind w:left="720"/>
       </w:pPr>
+      <m:oMath>
+        <m:sSub>
+          <m:e>
+            <m:r>
+              <w:rPr>
+                <w:rFonts w:ascii="Cambria Math" w:hAnsi="Cambria Math"/>
+                <w:sz w:val="24"/>
+                <w:szCs w:val="24"/>
+              </w:rPr>
+              <m:t xml:space="preserve">ICR</m:t>
+            </m:r>
+          </m:e>
+          <m:sub>
+            <m:r>
+              <w:rPr>
+                <w:rFonts w:ascii="Cambria Math" w:hAnsi="Cambria Math"/>
+                <w:sz w:val="24"/>
+                <w:szCs w:val="24"/>
+              </w:rPr>
+              <m:t xml:space="preserve">std</m:t>
+            </m:r>
+          </m:sub>
+        </m:sSub>
+        <m:r>
+          <m:rPr>
+            <m:sty m:val="p"/>
+          </m:rPr>
+          <w:rPr>
+            <w:rFonts w:ascii="Cambria Math" w:hAnsi="Cambria Math"/>
+            <w:sz w:val="24"/>
+            <w:szCs w:val="24"/>
+          </w:rPr>
+          <m:t xml:space="preserve">=</m:t>
+        </m:r>
+        <m:f>
+          <m:num>
+            <m:r>
+              <w:rPr>
+                <w:rFonts w:ascii="Cambria Math" w:hAnsi="Cambria Math"/>
+                <w:sz w:val="24"/>
+                <w:szCs w:val="24"/>
+              </w:rPr>
+              <m:t xml:space="preserve">d</m:t>
+            </m:r>
+          </m:num>
+          <m:den>
+            <m:r>
+              <w:rPr>
+                <w:rFonts w:ascii="Cambria Math" w:hAnsi="Cambria Math"/>
+                <w:sz w:val="24"/>
+                <w:szCs w:val="24"/>
+              </w:rPr>
+              <m:t xml:space="preserve">D</m:t>
+            </m:r>
+          </m:den>
+        </m:f>
+      </m:oMath>
       <w:r>
         <w:rPr>
           <w:rFonts w:ascii="Times New Roman" w:hAnsi="Times New Roman"/>
-          <w:i/>
         </w:rPr>
-        <w:t>ICR_std = d / D,</w:t>
+        <w:t>,</w:t>
       </w:r>
     </w:p>
     <w:p>
@@ -285,12 +473,219 @@
       <w:pPr>
         <w:ind w:left="720"/>
       </w:pPr>
+      <m:oMath>
+        <m:sSub>
+          <m:e>
+            <m:r>
+              <w:rPr>
+                <w:rFonts w:ascii="Cambria Math" w:hAnsi="Cambria Math"/>
+                <w:sz w:val="24"/>
+                <w:szCs w:val="24"/>
+              </w:rPr>
+              <m:t xml:space="preserve">ICR</m:t>
+            </m:r>
+          </m:e>
+          <m:sub>
+            <m:r>
+              <w:rPr>
+                <w:rFonts w:ascii="Cambria Math" w:hAnsi="Cambria Math"/>
+                <w:sz w:val="24"/>
+                <w:szCs w:val="24"/>
+              </w:rPr>
+              <m:t xml:space="preserve">raw</m:t>
+            </m:r>
+          </m:sub>
+        </m:sSub>
+        <m:r>
+          <m:rPr>
+            <m:sty m:val="p"/>
+          </m:rPr>
+          <w:rPr>
+            <w:rFonts w:ascii="Cambria Math" w:hAnsi="Cambria Math"/>
+            <w:sz w:val="24"/>
+            <w:szCs w:val="24"/>
+          </w:rPr>
+          <m:t xml:space="preserve">=</m:t>
+        </m:r>
+        <m:f>
+          <m:num>
+            <m:nary>
+              <m:naryPr>
+                <m:chr m:val="∑"/>
+              </m:naryPr>
+              <m:sub>
+                <m:r>
+                  <w:rPr>
+                    <w:rFonts w:ascii="Cambria Math" w:hAnsi="Cambria Math"/>
+                    <w:sz w:val="24"/>
+                    <w:szCs w:val="24"/>
+                  </w:rPr>
+                  <m:t xml:space="preserve">j</m:t>
+                </m:r>
+                <m:r>
+                  <m:rPr>
+                    <m:sty m:val="p"/>
+                  </m:rPr>
+                  <w:rPr>
+                    <w:rFonts w:ascii="Cambria Math" w:hAnsi="Cambria Math"/>
+                    <w:sz w:val="24"/>
+                    <w:szCs w:val="24"/>
+                  </w:rPr>
+                  <m:t xml:space="preserve">∈</m:t>
+                </m:r>
+                <m:r>
+                  <w:rPr>
+                    <w:rFonts w:ascii="Cambria Math" w:hAnsi="Cambria Math"/>
+                    <w:sz w:val="24"/>
+                    <w:szCs w:val="24"/>
+                  </w:rPr>
+                  <m:t xml:space="preserve">E</m:t>
+                </m:r>
+              </m:sub>
+              <m:e>
+                <m:r>
+                  <m:rPr>
+                    <m:sty m:val="p"/>
+                  </m:rPr>
+                  <w:rPr>
+                    <w:rFonts w:ascii="Cambria Math" w:hAnsi="Cambria Math"/>
+                    <w:sz w:val="24"/>
+                    <w:szCs w:val="24"/>
+                  </w:rPr>
+                  <m:t xml:space="preserve">Var</m:t>
+                </m:r>
+                <m:d>
+                  <m:dPr>
+                    <m:begChr m:val="("/>
+                    <m:endChr m:val=")"/>
+                  </m:dPr>
+                  <m:e>
+                    <m:sSub>
+                      <m:e>
+                        <m:r>
+                          <w:rPr>
+                            <w:rFonts w:ascii="Cambria Math" w:hAnsi="Cambria Math"/>
+                            <w:sz w:val="24"/>
+                            <w:szCs w:val="24"/>
+                          </w:rPr>
+                          <m:t xml:space="preserve">X</m:t>
+                        </m:r>
+                      </m:e>
+                      <m:sub>
+                        <m:r>
+                          <w:rPr>
+                            <w:rFonts w:ascii="Cambria Math" w:hAnsi="Cambria Math"/>
+                            <w:sz w:val="24"/>
+                            <w:szCs w:val="24"/>
+                          </w:rPr>
+                          <m:t xml:space="preserve">j</m:t>
+                        </m:r>
+                      </m:sub>
+                    </m:sSub>
+                  </m:e>
+                </m:d>
+              </m:e>
+            </m:nary>
+          </m:num>
+          <m:den>
+            <m:nary>
+              <m:naryPr>
+                <m:chr m:val="∑"/>
+              </m:naryPr>
+              <m:sub>
+                <m:r>
+                  <w:rPr>
+                    <w:rFonts w:ascii="Cambria Math" w:hAnsi="Cambria Math"/>
+                    <w:sz w:val="24"/>
+                    <w:szCs w:val="24"/>
+                  </w:rPr>
+                  <m:t xml:space="preserve">j</m:t>
+                </m:r>
+                <m:r>
+                  <m:rPr>
+                    <m:sty m:val="p"/>
+                  </m:rPr>
+                  <w:rPr>
+                    <w:rFonts w:ascii="Cambria Math" w:hAnsi="Cambria Math"/>
+                    <w:sz w:val="24"/>
+                    <w:szCs w:val="24"/>
+                  </w:rPr>
+                  <m:t xml:space="preserve">=</m:t>
+                </m:r>
+                <m:r>
+                  <m:rPr>
+                    <m:sty m:val="p"/>
+                  </m:rPr>
+                  <w:rPr>
+                    <w:rFonts w:ascii="Cambria Math" w:hAnsi="Cambria Math"/>
+                    <w:sz w:val="24"/>
+                    <w:szCs w:val="24"/>
+                  </w:rPr>
+                  <m:t xml:space="preserve">1</m:t>
+                </m:r>
+              </m:sub>
+              <m:sup>
+                <m:r>
+                  <w:rPr>
+                    <w:rFonts w:ascii="Cambria Math" w:hAnsi="Cambria Math"/>
+                    <w:sz w:val="24"/>
+                    <w:szCs w:val="24"/>
+                  </w:rPr>
+                  <m:t xml:space="preserve">D</m:t>
+                </m:r>
+              </m:sup>
+              <m:e>
+                <m:r>
+                  <m:rPr>
+                    <m:sty m:val="p"/>
+                  </m:rPr>
+                  <w:rPr>
+                    <w:rFonts w:ascii="Cambria Math" w:hAnsi="Cambria Math"/>
+                    <w:sz w:val="24"/>
+                    <w:szCs w:val="24"/>
+                  </w:rPr>
+                  <m:t xml:space="preserve">Var</m:t>
+                </m:r>
+                <m:d>
+                  <m:dPr>
+                    <m:begChr m:val="("/>
+                    <m:endChr m:val=")"/>
+                  </m:dPr>
+                  <m:e>
+                    <m:sSub>
+                      <m:e>
+                        <m:r>
+                          <w:rPr>
+                            <w:rFonts w:ascii="Cambria Math" w:hAnsi="Cambria Math"/>
+                            <w:sz w:val="24"/>
+                            <w:szCs w:val="24"/>
+                          </w:rPr>
+                          <m:t xml:space="preserve">X</m:t>
+                        </m:r>
+                      </m:e>
+                      <m:sub>
+                        <m:r>
+                          <w:rPr>
+                            <w:rFonts w:ascii="Cambria Math" w:hAnsi="Cambria Math"/>
+                            <w:sz w:val="24"/>
+                            <w:szCs w:val="24"/>
+                          </w:rPr>
+                          <m:t xml:space="preserve">j</m:t>
+                        </m:r>
+                      </m:sub>
+                    </m:sSub>
+                  </m:e>
+                </m:d>
+              </m:e>
+            </m:nary>
+          </m:den>
+        </m:f>
+      </m:oMath>
       <w:r>
         <w:rPr>
           <w:rFonts w:ascii="Times New Roman" w:hAnsi="Times New Roman"/>
-          <w:i/>
         </w:rPr>
-        <w:t>ICR_raw = sum_{j in E} Var(X_j) / sum_{j=1}^{D} Var(X_j),</w:t>
+        <w:t>,</w:t>
       </w:r>
     </w:p>
     <w:p>
@@ -349,12 +744,163 @@
       <w:pPr>
         <w:ind w:left="720"/>
       </w:pPr>
+      <m:oMath>
+        <m:sSub>
+          <m:e>
+            <m:r>
+              <w:rPr>
+                <w:rFonts w:ascii="Cambria Math" w:hAnsi="Cambria Math"/>
+                <w:sz w:val="24"/>
+                <w:szCs w:val="24"/>
+              </w:rPr>
+              <m:t xml:space="preserve">ICR</m:t>
+            </m:r>
+          </m:e>
+          <m:sub>
+            <m:r>
+              <w:rPr>
+                <w:rFonts w:ascii="Cambria Math" w:hAnsi="Cambria Math"/>
+                <w:sz w:val="24"/>
+                <w:szCs w:val="24"/>
+              </w:rPr>
+              <m:t xml:space="preserve">pca, loading</m:t>
+            </m:r>
+          </m:sub>
+        </m:sSub>
+        <m:r>
+          <m:rPr>
+            <m:sty m:val="p"/>
+          </m:rPr>
+          <w:rPr>
+            <w:rFonts w:ascii="Cambria Math" w:hAnsi="Cambria Math"/>
+            <w:sz w:val="24"/>
+            <w:szCs w:val="24"/>
+          </w:rPr>
+          <m:t xml:space="preserve">=</m:t>
+        </m:r>
+        <m:f>
+          <m:num>
+            <m:nary>
+              <m:naryPr>
+                <m:chr m:val="∑"/>
+              </m:naryPr>
+              <m:sub>
+                <m:r>
+                  <w:rPr>
+                    <w:rFonts w:ascii="Cambria Math" w:hAnsi="Cambria Math"/>
+                    <w:sz w:val="24"/>
+                    <w:szCs w:val="24"/>
+                  </w:rPr>
+                  <m:t xml:space="preserve">k</m:t>
+                </m:r>
+                <m:r>
+                  <m:rPr>
+                    <m:sty m:val="p"/>
+                  </m:rPr>
+                  <w:rPr>
+                    <w:rFonts w:ascii="Cambria Math" w:hAnsi="Cambria Math"/>
+                    <w:sz w:val="24"/>
+                    <w:szCs w:val="24"/>
+                  </w:rPr>
+                  <m:t xml:space="preserve">∈</m:t>
+                </m:r>
+                <m:sSub>
+                  <m:e>
+                    <m:r>
+                      <w:rPr>
+                        <w:rFonts w:ascii="Cambria Math" w:hAnsi="Cambria Math"/>
+                        <w:sz w:val="24"/>
+                        <w:szCs w:val="24"/>
+                      </w:rPr>
+                      <m:t xml:space="preserve">S</m:t>
+                    </m:r>
+                  </m:e>
+                  <m:sub>
+                    <m:r>
+                      <w:rPr>
+                        <w:rFonts w:ascii="Cambria Math" w:hAnsi="Cambria Math"/>
+                        <w:sz w:val="24"/>
+                        <w:szCs w:val="24"/>
+                      </w:rPr>
+                      <m:t xml:space="preserve">E</m:t>
+                    </m:r>
+                  </m:sub>
+                </m:sSub>
+              </m:sub>
+              <m:e>
+                <m:sSub>
+                  <m:e>
+                    <m:r>
+                      <w:rPr>
+                        <w:rFonts w:ascii="Cambria Math" w:hAnsi="Cambria Math"/>
+                        <w:sz w:val="24"/>
+                        <w:szCs w:val="24"/>
+                      </w:rPr>
+                      <m:t xml:space="preserve">λ</m:t>
+                    </m:r>
+                  </m:e>
+                  <m:sub>
+                    <m:r>
+                      <w:rPr>
+                        <w:rFonts w:ascii="Cambria Math" w:hAnsi="Cambria Math"/>
+                        <w:sz w:val="24"/>
+                        <w:szCs w:val="24"/>
+                      </w:rPr>
+                      <m:t xml:space="preserve">k</m:t>
+                    </m:r>
+                  </m:sub>
+                </m:sSub>
+              </m:e>
+            </m:nary>
+          </m:num>
+          <m:den>
+            <m:nary>
+              <m:naryPr>
+                <m:chr m:val="∑"/>
+              </m:naryPr>
+              <m:sub>
+                <m:r>
+                  <w:rPr>
+                    <w:rFonts w:ascii="Cambria Math" w:hAnsi="Cambria Math"/>
+                    <w:sz w:val="24"/>
+                    <w:szCs w:val="24"/>
+                  </w:rPr>
+                  <m:t xml:space="preserve">k</m:t>
+                </m:r>
+              </m:sub>
+              <m:e>
+                <m:sSub>
+                  <m:e>
+                    <m:r>
+                      <w:rPr>
+                        <w:rFonts w:ascii="Cambria Math" w:hAnsi="Cambria Math"/>
+                        <w:sz w:val="24"/>
+                        <w:szCs w:val="24"/>
+                      </w:rPr>
+                      <m:t xml:space="preserve">λ</m:t>
+                    </m:r>
+                  </m:e>
+                  <m:sub>
+                    <m:r>
+                      <w:rPr>
+                        <w:rFonts w:ascii="Cambria Math" w:hAnsi="Cambria Math"/>
+                        <w:sz w:val="24"/>
+                        <w:szCs w:val="24"/>
+                      </w:rPr>
+                      <m:t xml:space="preserve">k</m:t>
+                    </m:r>
+                  </m:sub>
+                </m:sSub>
+              </m:e>
+            </m:nary>
+          </m:den>
+        </m:f>
+      </m:oMath>
       <w:r>
         <w:rPr>
           <w:rFonts w:ascii="Times New Roman" w:hAnsi="Times New Roman"/>
-          <w:i/>
         </w:rPr>
-        <w:t>ICR_pca_loading = sum_{k in S_E} lambda_k / sum_k lambda_k.</w:t>
+        <w:t>.</w:t>
       </w:r>
     </w:p>
     <w:p>
@@ -370,12 +916,208 @@
       <w:pPr>
         <w:ind w:left="720"/>
       </w:pPr>
+      <m:oMath>
+        <m:sSub>
+          <m:e>
+            <m:r>
+              <w:rPr>
+                <w:rFonts w:ascii="Cambria Math" w:hAnsi="Cambria Math"/>
+                <w:sz w:val="24"/>
+                <w:szCs w:val="24"/>
+              </w:rPr>
+              <m:t xml:space="preserve">ICR</m:t>
+            </m:r>
+          </m:e>
+          <m:sub>
+            <m:r>
+              <w:rPr>
+                <w:rFonts w:ascii="Cambria Math" w:hAnsi="Cambria Math"/>
+                <w:sz w:val="24"/>
+                <w:szCs w:val="24"/>
+              </w:rPr>
+              <m:t xml:space="preserve">pca, reg</m:t>
+            </m:r>
+          </m:sub>
+        </m:sSub>
+        <m:r>
+          <m:rPr>
+            <m:sty m:val="p"/>
+          </m:rPr>
+          <w:rPr>
+            <w:rFonts w:ascii="Cambria Math" w:hAnsi="Cambria Math"/>
+            <w:sz w:val="24"/>
+            <w:szCs w:val="24"/>
+          </w:rPr>
+          <m:t xml:space="preserve">=</m:t>
+        </m:r>
+        <m:f>
+          <m:num>
+            <m:nary>
+              <m:naryPr>
+                <m:chr m:val="∑"/>
+              </m:naryPr>
+              <m:sub>
+                <m:r>
+                  <w:rPr>
+                    <w:rFonts w:ascii="Cambria Math" w:hAnsi="Cambria Math"/>
+                    <w:sz w:val="24"/>
+                    <w:szCs w:val="24"/>
+                  </w:rPr>
+                  <m:t xml:space="preserve">k</m:t>
+                </m:r>
+              </m:sub>
+              <m:e>
+                <m:sSubSup>
+                  <m:e>
+                    <m:r>
+                      <w:rPr>
+                        <w:rFonts w:ascii="Cambria Math" w:hAnsi="Cambria Math"/>
+                        <w:sz w:val="24"/>
+                        <w:szCs w:val="24"/>
+                      </w:rPr>
+                      <m:t xml:space="preserve">β</m:t>
+                    </m:r>
+                  </m:e>
+                  <m:sub>
+                    <m:r>
+                      <w:rPr>
+                        <w:rFonts w:ascii="Cambria Math" w:hAnsi="Cambria Math"/>
+                        <w:sz w:val="24"/>
+                        <w:szCs w:val="24"/>
+                      </w:rPr>
+                      <m:t xml:space="preserve">k</m:t>
+                    </m:r>
+                  </m:sub>
+                  <m:sup>
+                    <m:r>
+                      <w:rPr>
+                        <w:rFonts w:ascii="Cambria Math" w:hAnsi="Cambria Math"/>
+                        <w:sz w:val="24"/>
+                        <w:szCs w:val="24"/>
+                      </w:rPr>
+                      <m:t xml:space="preserve">2</m:t>
+                    </m:r>
+                  </m:sup>
+                </m:sSubSup>
+                <m:sSub>
+                  <m:e>
+                    <m:r>
+                      <w:rPr>
+                        <w:rFonts w:ascii="Cambria Math" w:hAnsi="Cambria Math"/>
+                        <w:sz w:val="24"/>
+                        <w:szCs w:val="24"/>
+                      </w:rPr>
+                      <m:t xml:space="preserve">λ</m:t>
+                    </m:r>
+                  </m:e>
+                  <m:sub>
+                    <m:r>
+                      <w:rPr>
+                        <w:rFonts w:ascii="Cambria Math" w:hAnsi="Cambria Math"/>
+                        <w:sz w:val="24"/>
+                        <w:szCs w:val="24"/>
+                      </w:rPr>
+                      <m:t xml:space="preserve">k</m:t>
+                    </m:r>
+                  </m:sub>
+                </m:sSub>
+              </m:e>
+            </m:nary>
+          </m:num>
+          <m:den>
+            <m:d>
+              <m:dPr>
+                <m:begChr m:val="("/>
+                <m:endChr m:val=")"/>
+              </m:dPr>
+              <m:e>
+                <m:nary>
+                  <m:naryPr>
+                    <m:chr m:val="∑"/>
+                  </m:naryPr>
+                  <m:sub>
+                    <m:r>
+                      <w:rPr>
+                        <w:rFonts w:ascii="Cambria Math" w:hAnsi="Cambria Math"/>
+                        <w:sz w:val="24"/>
+                        <w:szCs w:val="24"/>
+                      </w:rPr>
+                      <m:t xml:space="preserve">k</m:t>
+                    </m:r>
+                  </m:sub>
+                  <m:e>
+                    <m:sSub>
+                      <m:e>
+                        <m:r>
+                          <w:rPr>
+                            <w:rFonts w:ascii="Cambria Math" w:hAnsi="Cambria Math"/>
+                            <w:sz w:val="24"/>
+                            <w:szCs w:val="24"/>
+                          </w:rPr>
+                          <m:t xml:space="preserve">λ</m:t>
+                        </m:r>
+                      </m:e>
+                      <m:sub>
+                        <m:r>
+                          <w:rPr>
+                            <w:rFonts w:ascii="Cambria Math" w:hAnsi="Cambria Math"/>
+                            <w:sz w:val="24"/>
+                            <w:szCs w:val="24"/>
+                          </w:rPr>
+                          <m:t xml:space="preserve">k</m:t>
+                        </m:r>
+                      </m:sub>
+                    </m:sSub>
+                  </m:e>
+                </m:nary>
+                <m:r>
+                  <m:rPr>
+                    <m:sty m:val="p"/>
+                  </m:rPr>
+                  <w:rPr>
+                    <w:rFonts w:ascii="Cambria Math" w:hAnsi="Cambria Math"/>
+                    <w:sz w:val="24"/>
+                    <w:szCs w:val="24"/>
+                  </w:rPr>
+                  <m:t xml:space="preserve">+</m:t>
+                </m:r>
+                <m:r>
+                  <m:rPr>
+                    <m:sty m:val="p"/>
+                  </m:rPr>
+                  <w:rPr>
+                    <w:rFonts w:ascii="Cambria Math" w:hAnsi="Cambria Math"/>
+                    <w:sz w:val="24"/>
+                    <w:szCs w:val="24"/>
+                  </w:rPr>
+                  <m:t xml:space="preserve">Var</m:t>
+                </m:r>
+                <m:d>
+                  <m:dPr>
+                    <m:begChr m:val="("/>
+                    <m:endChr m:val=")"/>
+                  </m:dPr>
+                  <m:e>
+                    <m:r>
+                      <w:rPr>
+                        <w:rFonts w:ascii="Cambria Math" w:hAnsi="Cambria Math"/>
+                        <w:sz w:val="24"/>
+                        <w:szCs w:val="24"/>
+                      </w:rPr>
+                      <m:t xml:space="preserve">Y</m:t>
+                    </m:r>
+                  </m:e>
+                </m:d>
+              </m:e>
+            </m:d>
+          </m:den>
+        </m:f>
+      </m:oMath>
       <w:r>
         <w:rPr>
           <w:rFonts w:ascii="Times New Roman" w:hAnsi="Times New Roman"/>
-          <w:i/>
         </w:rPr>
-        <w:t>ICR_pca_reg = sum_k beta_k^2 lambda_k / (sum_k lambda_k + Var(Y)).</w:t>
+        <w:t>.</w:t>
       </w:r>
     </w:p>
     <w:p>

</xml_diff>